<commit_message>
added 1 more response + evaluation
</commit_message>
<xml_diff>
--- a/Analysis/question answers.docx
+++ b/Analysis/question answers.docx
@@ -1212,6 +1212,189 @@
     </w:p>
     <w:p/>
     <w:p>
+      <w:r>
+        <w:rPr>
+          <w:b/>
+          <w:bCs/>
+        </w:rPr>
+        <w:t>Connor:</w:t>
+      </w:r>
+    </w:p>
+    <w:p>
+      <w:pPr>
+        <w:pStyle w:val="ListParagraph"/>
+        <w:numPr>
+          <w:ilvl w:val="0"/>
+          <w:numId w:val="14"/>
+        </w:numPr>
+      </w:pPr>
+      <w:proofErr w:type="gramStart"/>
+      <w:r>
+        <w:t>Yes</w:t>
+      </w:r>
+      <w:proofErr w:type="gramEnd"/>
+      <w:r>
+        <w:t xml:space="preserve"> </w:t>
+      </w:r>
+      <w:proofErr w:type="spellStart"/>
+      <w:r>
+        <w:t>ive</w:t>
+      </w:r>
+      <w:proofErr w:type="spellEnd"/>
+      <w:r>
+        <w:t xml:space="preserve"> used it to improve my rotation through heat maps e.g. not staying one place at once or rotating into goal and mostly to look at more </w:t>
+      </w:r>
+      <w:proofErr w:type="spellStart"/>
+      <w:r>
+        <w:t>indepth</w:t>
+      </w:r>
+      <w:proofErr w:type="spellEnd"/>
+      <w:r>
+        <w:t xml:space="preserve"> stats of the games</w:t>
+      </w:r>
+    </w:p>
+    <w:p>
+      <w:pPr>
+        <w:pStyle w:val="ListParagraph"/>
+        <w:numPr>
+          <w:ilvl w:val="0"/>
+          <w:numId w:val="14"/>
+        </w:numPr>
+      </w:pPr>
+      <w:r>
+        <w:t>An overall rating of how you played in each game</w:t>
+      </w:r>
+    </w:p>
+    <w:p>
+      <w:pPr>
+        <w:pStyle w:val="ListParagraph"/>
+        <w:numPr>
+          <w:ilvl w:val="0"/>
+          <w:numId w:val="14"/>
+        </w:numPr>
+      </w:pPr>
+      <w:r>
+        <w:lastRenderedPageBreak/>
+        <w:t xml:space="preserve">chasey, controlled, fast, grounded, </w:t>
+      </w:r>
+      <w:proofErr w:type="spellStart"/>
+      <w:r>
+        <w:t>aerialed</w:t>
+      </w:r>
+      <w:proofErr w:type="spellEnd"/>
+    </w:p>
+    <w:p>
+      <w:pPr>
+        <w:pStyle w:val="ListParagraph"/>
+        <w:numPr>
+          <w:ilvl w:val="0"/>
+          <w:numId w:val="14"/>
+        </w:numPr>
+      </w:pPr>
+      <w:r>
+        <w:t>shadow defending a lot</w:t>
+      </w:r>
+    </w:p>
+    <w:p>
+      <w:pPr>
+        <w:pStyle w:val="ListParagraph"/>
+        <w:numPr>
+          <w:ilvl w:val="0"/>
+          <w:numId w:val="14"/>
+        </w:numPr>
+      </w:pPr>
+      <w:r>
+        <w:t>hesitation or bad decision making</w:t>
+      </w:r>
+    </w:p>
+    <w:p>
+      <w:pPr>
+        <w:pStyle w:val="ListParagraph"/>
+        <w:numPr>
+          <w:ilvl w:val="0"/>
+          <w:numId w:val="14"/>
+        </w:numPr>
+      </w:pPr>
+      <w:r>
+        <w:t>centre balls are more seen in higher ranks as a stat, long shots/clears are more seen in lower ranks because of less control</w:t>
+      </w:r>
+    </w:p>
+    <w:p>
+      <w:pPr>
+        <w:pStyle w:val="ListParagraph"/>
+        <w:numPr>
+          <w:ilvl w:val="0"/>
+          <w:numId w:val="14"/>
+        </w:numPr>
+      </w:pPr>
+      <w:r>
+        <w:t>champ - focus on being consistent rather than flashy</w:t>
+      </w:r>
+    </w:p>
+    <w:p>
+      <w:pPr>
+        <w:pStyle w:val="ListParagraph"/>
+        <w:numPr>
+          <w:ilvl w:val="0"/>
+          <w:numId w:val="14"/>
+        </w:numPr>
+      </w:pPr>
+      <w:r>
+        <w:t xml:space="preserve">probably percentage positioned in certain areas and percentage of time </w:t>
+      </w:r>
+      <w:proofErr w:type="spellStart"/>
+      <w:r>
+        <w:t>infront</w:t>
+      </w:r>
+      <w:proofErr w:type="spellEnd"/>
+      <w:r>
+        <w:t>/behind the ball</w:t>
+      </w:r>
+    </w:p>
+    <w:p>
+      <w:pPr>
+        <w:pStyle w:val="ListParagraph"/>
+        <w:numPr>
+          <w:ilvl w:val="0"/>
+          <w:numId w:val="14"/>
+        </w:numPr>
+      </w:pPr>
+      <w:r>
+        <w:t>that they either are too far up the pitch or are too close to the play/far away</w:t>
+      </w:r>
+    </w:p>
+    <w:p>
+      <w:pPr>
+        <w:rPr>
+          <w:b/>
+          <w:bCs/>
+        </w:rPr>
+      </w:pPr>
+      <w:r>
+        <w:rPr>
+          <w:b/>
+          <w:bCs/>
+        </w:rPr>
+        <w:t>Connor Evaluation:</w:t>
+      </w:r>
+    </w:p>
+    <w:p>
+      <w:r>
+        <w:t>The heatmaps would be useful to include in the data overview section, since they would highlight positioning patterns, however it would be hard to generalise this over many replays, and the implementation difficulty would be quite high. This is a feature included in ballchasing.com, so to improve it, I would need to find a way to display this over many replays, however this will lead to issues that will take away from the usefulness, which to address such that the visualisation and analysis is useful, would be very difficult and could be a project of its own, so I will consider but not prioritise this.</w:t>
+      </w:r>
+    </w:p>
+    <w:p>
+      <w:r>
+        <w:t>The advice for Champ level players will be useful, especially if I evidence this with data that shows they spend a lot of their time in the air and potentially have a low shot to goal ratio in the data comparison section, since this would indicate they may be focusing on the wrong part of their playstyle.</w:t>
+      </w:r>
+    </w:p>
+    <w:p>
+      <w:r>
+        <w:t>The rest of the answers solidify what was previously said or add to it, so will be considered overall.</w:t>
+      </w:r>
+    </w:p>
+    <w:p/>
+    <w:p>
       <w:pPr>
         <w:rPr>
           <w:b/>
@@ -1250,7 +1433,6 @@
         </w:numPr>
       </w:pPr>
       <w:r>
-        <w:lastRenderedPageBreak/>
         <w:t>High replay upload limit / automatic implementation (possibly), allows for more useful data comparison and easier pattern spotting (to figure out flaws)</w:t>
       </w:r>
     </w:p>
@@ -2663,6 +2845,92 @@
           <w:tab w:val="num" w:pos="6480"/>
         </w:tabs>
         <w:ind w:left="6480" w:hanging="360"/>
+      </w:pPr>
+    </w:lvl>
+  </w:abstractNum>
+  <w:abstractNum w:abstractNumId="13" w15:restartNumberingAfterBreak="0">
+    <w:nsid w:val="7AF56A3B"/>
+    <w:multiLevelType w:val="hybridMultilevel"/>
+    <w:tmpl w:val="6F102F6A"/>
+    <w:lvl w:ilvl="0" w:tplc="0809000F">
+      <w:start w:val="1"/>
+      <w:numFmt w:val="decimal"/>
+      <w:lvlText w:val="%1."/>
+      <w:lvlJc w:val="left"/>
+      <w:pPr>
+        <w:ind w:left="720" w:hanging="360"/>
+      </w:pPr>
+    </w:lvl>
+    <w:lvl w:ilvl="1" w:tplc="08090019" w:tentative="1">
+      <w:start w:val="1"/>
+      <w:numFmt w:val="lowerLetter"/>
+      <w:lvlText w:val="%2."/>
+      <w:lvlJc w:val="left"/>
+      <w:pPr>
+        <w:ind w:left="1440" w:hanging="360"/>
+      </w:pPr>
+    </w:lvl>
+    <w:lvl w:ilvl="2" w:tplc="0809001B" w:tentative="1">
+      <w:start w:val="1"/>
+      <w:numFmt w:val="lowerRoman"/>
+      <w:lvlText w:val="%3."/>
+      <w:lvlJc w:val="right"/>
+      <w:pPr>
+        <w:ind w:left="2160" w:hanging="180"/>
+      </w:pPr>
+    </w:lvl>
+    <w:lvl w:ilvl="3" w:tplc="0809000F" w:tentative="1">
+      <w:start w:val="1"/>
+      <w:numFmt w:val="decimal"/>
+      <w:lvlText w:val="%4."/>
+      <w:lvlJc w:val="left"/>
+      <w:pPr>
+        <w:ind w:left="2880" w:hanging="360"/>
+      </w:pPr>
+    </w:lvl>
+    <w:lvl w:ilvl="4" w:tplc="08090019" w:tentative="1">
+      <w:start w:val="1"/>
+      <w:numFmt w:val="lowerLetter"/>
+      <w:lvlText w:val="%5."/>
+      <w:lvlJc w:val="left"/>
+      <w:pPr>
+        <w:ind w:left="3600" w:hanging="360"/>
+      </w:pPr>
+    </w:lvl>
+    <w:lvl w:ilvl="5" w:tplc="0809001B" w:tentative="1">
+      <w:start w:val="1"/>
+      <w:numFmt w:val="lowerRoman"/>
+      <w:lvlText w:val="%6."/>
+      <w:lvlJc w:val="right"/>
+      <w:pPr>
+        <w:ind w:left="4320" w:hanging="180"/>
+      </w:pPr>
+    </w:lvl>
+    <w:lvl w:ilvl="6" w:tplc="0809000F" w:tentative="1">
+      <w:start w:val="1"/>
+      <w:numFmt w:val="decimal"/>
+      <w:lvlText w:val="%7."/>
+      <w:lvlJc w:val="left"/>
+      <w:pPr>
+        <w:ind w:left="5040" w:hanging="360"/>
+      </w:pPr>
+    </w:lvl>
+    <w:lvl w:ilvl="7" w:tplc="08090019" w:tentative="1">
+      <w:start w:val="1"/>
+      <w:numFmt w:val="lowerLetter"/>
+      <w:lvlText w:val="%8."/>
+      <w:lvlJc w:val="left"/>
+      <w:pPr>
+        <w:ind w:left="5760" w:hanging="360"/>
+      </w:pPr>
+    </w:lvl>
+    <w:lvl w:ilvl="8" w:tplc="0809001B" w:tentative="1">
+      <w:start w:val="1"/>
+      <w:numFmt w:val="lowerRoman"/>
+      <w:lvlText w:val="%9."/>
+      <w:lvlJc w:val="right"/>
+      <w:pPr>
+        <w:ind w:left="6480" w:hanging="180"/>
       </w:pPr>
     </w:lvl>
   </w:abstractNum>
@@ -2704,6 +2972,9 @@
   </w:num>
   <w:num w:numId="13" w16cid:durableId="1756635026">
     <w:abstractNumId w:val="7"/>
+  </w:num>
+  <w:num w:numId="14" w16cid:durableId="912617185">
+    <w:abstractNumId w:val="13"/>
   </w:num>
 </w:numbering>
 </file>
@@ -3312,6 +3583,7 @@
   <w:style w:type="character" w:default="1" w:styleId="DefaultParagraphFont">
     <w:name w:val="Default Paragraph Font"/>
     <w:uiPriority w:val="1"/>
+    <w:semiHidden/>
     <w:unhideWhenUsed/>
   </w:style>
   <w:style w:type="table" w:default="1" w:styleId="TableNormal">

</xml_diff>